<commit_message>
figure caption mixup fix
</commit_message>
<xml_diff>
--- a/writeups/177B_JoVE_Manuscript.docx
+++ b/writeups/177B_JoVE_Manuscript.docx
@@ -2104,32 +2104,26 @@
         </w:rPr>
       </w:pPr>
       <w:r>
-        <w:rPr>
-          <w:rFonts w:asciiTheme="majorHAnsi" w:hAnsiTheme="majorHAnsi" w:cstheme="majorHAnsi"/>
-        </w:rPr>
-        <w:t xml:space="preserve">Sample images of the organoids under different microscope conditions can be seen in Figure 8 for reference. Figures 9 and 10 show clear visual differences in calcium signaling and contraction between the control and drug treated organoids. In Figure 9, the control group shows regular and consistent calcium peaks, while the thapsigargin samples appear more irregular, which matches the higher beat-to-beat variability we measured. The dofetilide and quinidine traces also look broader and return to baseline more slowly, suggesting slower calcium decay.</w:t>
-      </w:r>
-    </w:p>
-    <w:p>
-      <w:pPr>
-        <w:jc w:val="left"/>
-        <w:rPr>
-          <w:rFonts w:asciiTheme="majorHAnsi" w:hAnsiTheme="majorHAnsi" w:cstheme="majorHAnsi"/>
-        </w:rPr>
-      </w:pPr>
-    </w:p>
-    <w:p>
-      <w:pPr>
-        <w:jc w:val="left"/>
-        <w:rPr>
-          <w:rFonts w:asciiTheme="majorHAnsi" w:hAnsiTheme="majorHAnsi" w:cstheme="majorHAnsi"/>
-        </w:rPr>
-      </w:pPr>
-      <w:r>
-        <w:rPr>
-          <w:rFonts w:asciiTheme="majorHAnsi" w:hAnsiTheme="majorHAnsi" w:cstheme="majorHAnsi"/>
-        </w:rPr>
-        <w:t xml:space="preserve">Similar patterns can also be seen in the mechanical contraction traces in Figure 10. The control group shows steady contractions, while the thapsigargin samples appear less regular and the dofetilide and quinidine traces look wider, suggesting longer contraction and relaxation phases.</w:t>
+        <w:t>Sample images of the organoids under different microscope conditions can be seen in Figure 8 for reference. Figures 9 and 10 show clear visual differences in calcium signaling and contraction between the control and drug treated organoids. In Figure 10, the control group shows regular and consistent calcium peaks, while the thapsigargin samples appear more irregular, which matches the higher beat-to-beat variability we measured. The dofetilide and quinidine traces also look broader and return to baseline more slowly, suggesting slower calcium decay.</w:t>
+      </w:r>
+    </w:p>
+    <w:p>
+      <w:pPr>
+        <w:jc w:val="left"/>
+        <w:rPr>
+          <w:rFonts w:asciiTheme="majorHAnsi" w:hAnsiTheme="majorHAnsi" w:cstheme="majorHAnsi"/>
+        </w:rPr>
+      </w:pPr>
+    </w:p>
+    <w:p>
+      <w:pPr>
+        <w:jc w:val="left"/>
+        <w:rPr>
+          <w:rFonts w:asciiTheme="majorHAnsi" w:hAnsiTheme="majorHAnsi" w:cstheme="majorHAnsi"/>
+        </w:rPr>
+      </w:pPr>
+      <w:r>
+        <w:t>Similar patterns can also be seen in the mechanical contraction traces in Figure 9. The control group shows steady contractions, while the thapsigargin samples appear less regular and the dofetilide and quinidine traces look wider, suggesting longer contraction and relaxation phases.</w:t>
       </w:r>
     </w:p>
     <w:p>

</xml_diff>

<commit_message>
troubleshooting the protocol (electrodes)
</commit_message>
<xml_diff>
--- a/writeups/177B_JoVE_Manuscript.docx
+++ b/writeups/177B_JoVE_Manuscript.docx
@@ -2739,6 +2739,21 @@
           <w:color w:val="000000"/>
         </w:rPr>
       </w:pPr>
+    </w:p>
+    <w:p>
+      <w:pPr/>
+      <w:r>
+        <w:rPr>
+          <w:b/>
+        </w:rPr>
+        <w:t>Troubleshooting the Protocol</w:t>
+      </w:r>
+    </w:p>
+    <w:p>
+      <w:pPr/>
+      <w:r>
+        <w:t>If organoids cannot be paced, adjust the electrodes and ensure that the level of medium in the wells is sufficient. Sufficient, continuous medium with no gaps is required for current to flow; however, excess medium weakens the current.</w:t>
+      </w:r>
     </w:p>
     <w:p>
       <w:pPr>

</xml_diff>

<commit_message>
adding in yuqi's diagram + renumbering figs
</commit_message>
<xml_diff>
--- a/writeups/177B_JoVE_Manuscript.docx
+++ b/writeups/177B_JoVE_Manuscript.docx
@@ -1500,7 +1500,7 @@
     <w:p>
       <w:pPr/>
       <w:r>
-        <w:t>1) Assemble and wire the components as shown in Figure X. Ensure that the battery is sufficiently charged.</w:t>
+        <w:t>1) Assemble and wire the components as shown in Figure 7. Ensure that the battery is sufficiently charged.</w:t>
       </w:r>
     </w:p>
     <w:p>
@@ -1554,6 +1554,12 @@
           <w:rFonts w:asciiTheme="majorHAnsi" w:hAnsiTheme="majorHAnsi" w:cstheme="majorHAnsi"/>
         </w:rPr>
         <w:t xml:space="preserve"> here]</w:t>
+      </w:r>
+    </w:p>
+    <w:p>
+      <w:pPr/>
+      <w:r>
+        <w:t>[Place Figure 6 here]</w:t>
       </w:r>
     </w:p>
     <w:p>
@@ -1761,45 +1767,26 @@
         </w:rPr>
       </w:pPr>
       <w:r>
-        <w:rPr>
-          <w:rFonts w:asciiTheme="majorHAnsi" w:hAnsiTheme="majorHAnsi" w:cstheme="majorHAnsi"/>
-        </w:rPr>
-        <w:t xml:space="preserve">As shown in Figure 6, drug exposure experiments were performed sequentially using the same organoid. Treatments began with the lowest concentration for each drug. A single organoid was transferred into a clean well containing 0.5 mL of the prepared working solution and incubated for 10 minutes. After incubation, the organoid was transferred to the imaging chip and imaged using both brightfield and fluorescence microscopy. This procedure was repeated for each compound.</w:t>
-      </w:r>
-    </w:p>
-    <w:p>
-      <w:pPr>
-        <w:jc w:val="left"/>
-        <w:rPr>
-          <w:rFonts w:asciiTheme="majorHAnsi" w:hAnsiTheme="majorHAnsi" w:cstheme="majorHAnsi"/>
-        </w:rPr>
-      </w:pPr>
-    </w:p>
-    <w:p>
-      <w:pPr>
-        <w:jc w:val="left"/>
-        <w:rPr>
-          <w:rFonts w:asciiTheme="majorHAnsi" w:hAnsiTheme="majorHAnsi" w:cstheme="majorHAnsi"/>
-        </w:rPr>
-      </w:pPr>
-      <w:r>
-        <w:rPr>
-          <w:rFonts w:asciiTheme="majorHAnsi" w:hAnsiTheme="majorHAnsi" w:cstheme="majorHAnsi"/>
-        </w:rPr>
-        <w:t xml:space="preserve">[Place </w:t>
-      </w:r>
-      <w:r>
-        <w:rPr>
-          <w:rFonts w:asciiTheme="majorHAnsi" w:hAnsiTheme="majorHAnsi" w:cstheme="majorHAnsi"/>
-          <w:b/>
-        </w:rPr>
-        <w:t xml:space="preserve">Figure 6</w:t>
-      </w:r>
-      <w:r>
-        <w:rPr>
-          <w:rFonts w:asciiTheme="majorHAnsi" w:hAnsiTheme="majorHAnsi" w:cstheme="majorHAnsi"/>
-        </w:rPr>
-        <w:t xml:space="preserve"> here]</w:t>
+        <w:t>As shown in Figure 7, drug exposure experiments were performed sequentially using the same organoid. Treatments began with the lowest concentration for each drug. A single organoid was transferred into a clean well containing 0.5 mL of the prepared working solution and incubated for 10 minutes. After incubation, the organoid was transferred to the imaging chip and imaged using both brightfield and fluorescence microscopy. This procedure was repeated for each compound.</w:t>
+      </w:r>
+    </w:p>
+    <w:p>
+      <w:pPr>
+        <w:jc w:val="left"/>
+        <w:rPr>
+          <w:rFonts w:asciiTheme="majorHAnsi" w:hAnsiTheme="majorHAnsi" w:cstheme="majorHAnsi"/>
+        </w:rPr>
+      </w:pPr>
+    </w:p>
+    <w:p>
+      <w:pPr>
+        <w:jc w:val="left"/>
+        <w:rPr>
+          <w:rFonts w:asciiTheme="majorHAnsi" w:hAnsiTheme="majorHAnsi" w:cstheme="majorHAnsi"/>
+        </w:rPr>
+      </w:pPr>
+      <w:r>
+        <w:t>[Place Figure 7 here]</w:t>
       </w:r>
     </w:p>
     <w:p>
@@ -1890,58 +1877,42 @@
     <w:p>
       <w:pPr/>
       <w:r>
-        <w:t>8) See a summary of the analysis pipeline in Figure 7, and access the code in the GitHub repository: https://github.com/sanskriti-ss/miniscope_fullstack.</w:t>
-      </w:r>
-    </w:p>
-    <w:p>
-      <w:pPr>
-        <w:jc w:val="left"/>
-        <w:rPr>
-          <w:rFonts w:asciiTheme="majorHAnsi" w:hAnsiTheme="majorHAnsi" w:cstheme="majorHAnsi"/>
-        </w:rPr>
-      </w:pPr>
-    </w:p>
-    <w:p>
-      <w:pPr>
-        <w:jc w:val="left"/>
-        <w:rPr>
-          <w:rFonts w:asciiTheme="majorHAnsi" w:hAnsiTheme="majorHAnsi" w:cstheme="majorHAnsi"/>
-        </w:rPr>
-      </w:pPr>
-    </w:p>
-    <w:p>
-      <w:pPr>
-        <w:jc w:val="left"/>
-        <w:rPr>
-          <w:rFonts w:asciiTheme="majorHAnsi" w:hAnsiTheme="majorHAnsi" w:cstheme="majorHAnsi"/>
-        </w:rPr>
-      </w:pPr>
-    </w:p>
-    <w:p>
-      <w:pPr>
-        <w:jc w:val="left"/>
-        <w:rPr>
-          <w:rFonts w:asciiTheme="majorHAnsi" w:hAnsiTheme="majorHAnsi" w:cstheme="majorHAnsi"/>
-        </w:rPr>
-      </w:pPr>
-      <w:r>
-        <w:rPr>
-          <w:rFonts w:asciiTheme="majorHAnsi" w:hAnsiTheme="majorHAnsi" w:cstheme="majorHAnsi"/>
-        </w:rPr>
-        <w:t xml:space="preserve">[Place </w:t>
-      </w:r>
-      <w:r>
-        <w:rPr>
-          <w:rFonts w:asciiTheme="majorHAnsi" w:hAnsiTheme="majorHAnsi" w:cstheme="majorHAnsi"/>
-          <w:b/>
-        </w:rPr>
-        <w:t xml:space="preserve">Figure 7</w:t>
-      </w:r>
-      <w:r>
-        <w:rPr>
-          <w:rFonts w:asciiTheme="majorHAnsi" w:hAnsiTheme="majorHAnsi" w:cstheme="majorHAnsi"/>
-        </w:rPr>
-        <w:t xml:space="preserve"> here]</w:t>
+        <w:t>8) See a summary of the analysis pipeline in Figure 8, and access the code in the GitHub repository: https://github.com/sanskriti-ss/miniscope_fullstack.</w:t>
+      </w:r>
+    </w:p>
+    <w:p>
+      <w:pPr>
+        <w:jc w:val="left"/>
+        <w:rPr>
+          <w:rFonts w:asciiTheme="majorHAnsi" w:hAnsiTheme="majorHAnsi" w:cstheme="majorHAnsi"/>
+        </w:rPr>
+      </w:pPr>
+    </w:p>
+    <w:p>
+      <w:pPr>
+        <w:jc w:val="left"/>
+        <w:rPr>
+          <w:rFonts w:asciiTheme="majorHAnsi" w:hAnsiTheme="majorHAnsi" w:cstheme="majorHAnsi"/>
+        </w:rPr>
+      </w:pPr>
+    </w:p>
+    <w:p>
+      <w:pPr>
+        <w:jc w:val="left"/>
+        <w:rPr>
+          <w:rFonts w:asciiTheme="majorHAnsi" w:hAnsiTheme="majorHAnsi" w:cstheme="majorHAnsi"/>
+        </w:rPr>
+      </w:pPr>
+    </w:p>
+    <w:p>
+      <w:pPr>
+        <w:jc w:val="left"/>
+        <w:rPr>
+          <w:rFonts w:asciiTheme="majorHAnsi" w:hAnsiTheme="majorHAnsi" w:cstheme="majorHAnsi"/>
+        </w:rPr>
+      </w:pPr>
+      <w:r>
+        <w:t>[Place Figure 8 here]</w:t>
       </w:r>
     </w:p>
     <w:p>
@@ -1999,612 +1970,511 @@
         </w:rPr>
       </w:pPr>
       <w:r>
-        <w:rPr>
-          <w:rFonts w:asciiTheme="majorHAnsi" w:hAnsiTheme="majorHAnsi" w:cstheme="majorHAnsi"/>
-        </w:rPr>
-        <w:t xml:space="preserve">[Place </w:t>
-      </w:r>
+        <w:t>[Place Figure 9 here]</w:t>
+      </w:r>
+    </w:p>
+    <w:p>
+      <w:pPr>
+        <w:jc w:val="left"/>
+        <w:rPr>
+          <w:rFonts w:asciiTheme="majorHAnsi" w:hAnsiTheme="majorHAnsi" w:cstheme="majorHAnsi"/>
+        </w:rPr>
+      </w:pPr>
+    </w:p>
+    <w:p>
+      <w:pPr>
+        <w:jc w:val="left"/>
+        <w:rPr>
+          <w:rFonts w:asciiTheme="majorHAnsi" w:hAnsiTheme="majorHAnsi" w:cstheme="majorHAnsi"/>
+        </w:rPr>
+      </w:pPr>
+      <w:r>
+        <w:t>[Place Figure 10 here]</w:t>
+      </w:r>
+    </w:p>
+    <w:p>
+      <w:pPr>
+        <w:jc w:val="left"/>
+        <w:rPr>
+          <w:rFonts w:asciiTheme="majorHAnsi" w:hAnsiTheme="majorHAnsi" w:cstheme="majorHAnsi"/>
+        </w:rPr>
+      </w:pPr>
+    </w:p>
+    <w:p>
+      <w:pPr>
+        <w:jc w:val="left"/>
+        <w:rPr>
+          <w:rFonts w:asciiTheme="majorHAnsi" w:hAnsiTheme="majorHAnsi" w:cstheme="majorHAnsi"/>
+        </w:rPr>
+      </w:pPr>
+      <w:r>
+        <w:t>[Place Figure 11 here]</w:t>
+      </w:r>
+    </w:p>
+    <w:p>
+      <w:pPr>
+        <w:jc w:val="left"/>
+        <w:rPr>
+          <w:rFonts w:asciiTheme="majorHAnsi" w:hAnsiTheme="majorHAnsi" w:cstheme="majorHAnsi"/>
+        </w:rPr>
+      </w:pPr>
+    </w:p>
+    <w:p>
+      <w:pPr>
+        <w:jc w:val="left"/>
+        <w:rPr>
+          <w:rFonts w:asciiTheme="majorHAnsi" w:hAnsiTheme="majorHAnsi" w:cstheme="majorHAnsi"/>
+        </w:rPr>
+      </w:pPr>
+      <w:r>
+        <w:t>Sample images of the organoids under different microscope conditions can be seen in Figure 9 for reference. Figures 10 and 10 show clear visual differences in calcium signaling and contraction between the control and drug treated organoids. In Figure 11, the control group shows regular and consistent calcium peaks, while the thapsigargin samples appear more irregular, which matches the higher beat-to-beat variability we measured. The dofetilide and quinidine traces also look broader and return to baseline more slowly, suggesting slower calcium decay.</w:t>
+      </w:r>
+    </w:p>
+    <w:p>
+      <w:pPr>
+        <w:jc w:val="left"/>
+        <w:rPr>
+          <w:rFonts w:asciiTheme="majorHAnsi" w:hAnsiTheme="majorHAnsi" w:cstheme="majorHAnsi"/>
+        </w:rPr>
+      </w:pPr>
+    </w:p>
+    <w:p>
+      <w:pPr>
+        <w:jc w:val="left"/>
+        <w:rPr>
+          <w:rFonts w:asciiTheme="majorHAnsi" w:hAnsiTheme="majorHAnsi" w:cstheme="majorHAnsi"/>
+        </w:rPr>
+      </w:pPr>
+      <w:r>
+        <w:t>Similar patterns can also be seen in the mechanical contraction traces in Figure 10. The control group shows steady contractions, while the thapsigargin samples appear less regular and the dofetilide and quinidine traces look wider, suggesting longer contraction and relaxation phases.</w:t>
+      </w:r>
+    </w:p>
+    <w:p>
+      <w:pPr>
+        <w:jc w:val="left"/>
+        <w:rPr>
+          <w:rFonts w:asciiTheme="majorHAnsi" w:hAnsiTheme="majorHAnsi" w:cstheme="majorHAnsi"/>
+        </w:rPr>
+      </w:pPr>
+    </w:p>
+    <w:p>
+      <w:pPr>
+        <w:jc w:val="left"/>
+        <w:rPr>
+          <w:rFonts w:asciiTheme="majorHAnsi" w:hAnsiTheme="majorHAnsi" w:cstheme="majorHAnsi"/>
+        </w:rPr>
+      </w:pPr>
+      <w:r>
+        <w:t>[Place Figure 12 here]</w:t>
+      </w:r>
+    </w:p>
+    <w:p>
+      <w:pPr>
+        <w:jc w:val="left"/>
+        <w:rPr>
+          <w:rFonts w:asciiTheme="majorHAnsi" w:hAnsiTheme="majorHAnsi" w:cstheme="majorHAnsi"/>
+        </w:rPr>
+      </w:pPr>
+    </w:p>
+    <w:p>
+      <w:pPr>
+        <w:jc w:val="left"/>
+        <w:rPr>
+          <w:rFonts w:asciiTheme="majorHAnsi" w:hAnsiTheme="majorHAnsi" w:cstheme="majorHAnsi"/>
+        </w:rPr>
+      </w:pPr>
+      <w:r>
+        <w:t>[Place Figure 13 here]</w:t>
+      </w:r>
+    </w:p>
+    <w:p>
+      <w:pPr>
+        <w:jc w:val="left"/>
+        <w:rPr>
+          <w:rFonts w:asciiTheme="majorHAnsi" w:hAnsiTheme="majorHAnsi" w:cstheme="majorHAnsi"/>
+        </w:rPr>
+      </w:pPr>
+    </w:p>
+    <w:p>
+      <w:pPr>
+        <w:jc w:val="left"/>
+        <w:rPr>
+          <w:rFonts w:asciiTheme="majorHAnsi" w:hAnsiTheme="majorHAnsi" w:cstheme="majorHAnsi"/>
+        </w:rPr>
+      </w:pPr>
+      <w:r>
+        <w:t>These experimental results largely align with our predicted effects for each drug on calcium transient dynamics and contraction in the cardiac organoids. Figure 12 shows that Dolfetide, which is an IKr potassium channel blocker expected to prolong repolarization, predicted an increase in calcium transience duration and slower intracellular calcium clearance. The data shows an increase in both Decay50  and relaxation time compared with the control indicating more prolonged calcium signaling and a delay in recovery after contraction. Contraction time was also slightly elevated, consistent with the idea that prolonging the cardiac action potential extends the calcium transient.</w:t>
+      </w:r>
+    </w:p>
+    <w:p>
+      <w:pPr>
+        <w:jc w:val="left"/>
+        <w:rPr>
+          <w:rFonts w:asciiTheme="majorHAnsi" w:hAnsiTheme="majorHAnsi" w:cstheme="majorHAnsi"/>
+        </w:rPr>
+      </w:pPr>
+    </w:p>
+    <w:p>
+      <w:pPr>
+        <w:jc w:val="left"/>
+        <w:rPr>
+          <w:rFonts w:asciiTheme="majorHAnsi" w:hAnsiTheme="majorHAnsi" w:cstheme="majorHAnsi"/>
+        </w:rPr>
+      </w:pPr>
+      <w:r>
+        <w:rPr>
+          <w:rFonts w:asciiTheme="majorHAnsi" w:hAnsiTheme="majorHAnsi" w:cstheme="majorHAnsi"/>
+        </w:rPr>
+        <w:t xml:space="preserve">For thapsigargin, the results followed consistent trends although some variation was observed from expected outcomes. Organoids treated with Thapsigargin which inhibits SERCA are expected to disrupt calcium reuptake and beating patterns. The changes in the calcium transient parameters such as relaxation and decay were smaller than anticipated. However, The organoids treated with thapsigargin showed the largest increase in beat-to-beat variability, which supports the idea that inhibiting SERCA reduces rhythm stability.</w:t>
+      </w:r>
+    </w:p>
+    <w:p>
+      <w:pPr>
+        <w:jc w:val="left"/>
+        <w:rPr>
+          <w:rFonts w:asciiTheme="majorHAnsi" w:hAnsiTheme="majorHAnsi" w:cstheme="majorHAnsi"/>
+        </w:rPr>
+      </w:pPr>
+    </w:p>
+    <w:p>
+      <w:pPr>
+        <w:jc w:val="left"/>
+        <w:rPr>
+          <w:rFonts w:asciiTheme="majorHAnsi" w:hAnsiTheme="majorHAnsi" w:cstheme="majorHAnsi"/>
+        </w:rPr>
+      </w:pPr>
+      <w:r>
+        <w:rPr>
+          <w:rFonts w:asciiTheme="majorHAnsi" w:hAnsiTheme="majorHAnsi" w:cstheme="majorHAnsi"/>
+        </w:rPr>
+        <w:t xml:space="preserve">For quinidine, the observed results showed an increase in Decay50 and relaxation time compared to the control, indicating slower calcium clearance after each beat. However, contraction time was slightly lower than the control condition, suggesting that quinidine affected calcium decay and relaxation more than the contraction phase in this dataset.</w:t>
+      </w:r>
+    </w:p>
+    <w:p>
+      <w:pPr>
+        <w:jc w:val="left"/>
+        <w:rPr>
+          <w:rFonts w:asciiTheme="majorHAnsi" w:hAnsiTheme="majorHAnsi" w:cstheme="majorHAnsi"/>
+        </w:rPr>
+      </w:pPr>
+    </w:p>
+    <w:p>
+      <w:pPr>
+        <w:jc w:val="left"/>
+        <w:rPr>
+          <w:rFonts w:asciiTheme="majorHAnsi" w:hAnsiTheme="majorHAnsi" w:cstheme="majorHAnsi"/>
+        </w:rPr>
+      </w:pPr>
+      <w:r>
+        <w:t>Due to the relatively low sample size illustrated by Figure 13, and testing limitations, the results do not fully reflect all of the expected outcomes predicted from the pharmacological mechanisms of the drugs. However, the observed trends are consistent within each drug class and generally align with the anticipated direction of change in calcium transient and contraction dynamics. Despite the variability in some measurements the system was still able to detect clear differences between control organoids and those exposed to the different drugs. This consistency suggests that the platform is sensitive enough to capture meaningful changes in organoid behavior. Importantly, the device was able to identify measurable changes in both contractile behavior and calcium transient dynamics. This indicates that it can simultaneously monitor functional and electrophysiological responses of cardiac organoids.</w:t>
+      </w:r>
+    </w:p>
+    <w:p>
+      <w:pPr>
+        <w:rPr>
+          <w:rFonts w:asciiTheme="majorHAnsi" w:hAnsiTheme="majorHAnsi" w:cstheme="majorHAnsi"/>
+          <w:color w:val="808080"/>
+        </w:rPr>
+      </w:pPr>
+    </w:p>
+    <w:p>
+      <w:pPr>
+        <w:rPr>
+          <w:rFonts w:asciiTheme="majorHAnsi" w:hAnsiTheme="majorHAnsi" w:cstheme="majorHAnsi"/>
+          <w:color w:val="808080"/>
+        </w:rPr>
+      </w:pPr>
       <w:r>
         <w:rPr>
           <w:rFonts w:asciiTheme="majorHAnsi" w:hAnsiTheme="majorHAnsi" w:cstheme="majorHAnsi"/>
           <w:b/>
         </w:rPr>
-        <w:t xml:space="preserve">Figure 8</w:t>
-      </w:r>
-      <w:r>
-        <w:rPr>
-          <w:rFonts w:asciiTheme="majorHAnsi" w:hAnsiTheme="majorHAnsi" w:cstheme="majorHAnsi"/>
-        </w:rPr>
-        <w:t xml:space="preserve"> here]</w:t>
-      </w:r>
-    </w:p>
-    <w:p>
-      <w:pPr>
-        <w:jc w:val="left"/>
-        <w:rPr>
-          <w:rFonts w:asciiTheme="majorHAnsi" w:hAnsiTheme="majorHAnsi" w:cstheme="majorHAnsi"/>
-        </w:rPr>
-      </w:pPr>
-    </w:p>
-    <w:p>
-      <w:pPr>
-        <w:jc w:val="left"/>
-        <w:rPr>
-          <w:rFonts w:asciiTheme="majorHAnsi" w:hAnsiTheme="majorHAnsi" w:cstheme="majorHAnsi"/>
-        </w:rPr>
-      </w:pPr>
-      <w:r>
-        <w:rPr>
-          <w:rFonts w:asciiTheme="majorHAnsi" w:hAnsiTheme="majorHAnsi" w:cstheme="majorHAnsi"/>
-        </w:rPr>
-        <w:t xml:space="preserve">[Place </w:t>
-      </w:r>
-      <w:r>
+        <w:t>FIGURE AND TABLE LEGENDS:</w:t>
+      </w:r>
+    </w:p>
+    <w:p>
+      <w:pPr>
+        <w:jc w:val="left"/>
+        <w:rPr>
+          <w:rFonts w:asciiTheme="majorHAnsi" w:hAnsiTheme="majorHAnsi" w:cstheme="majorHAnsi"/>
+        </w:rPr>
+      </w:pPr>
+      <w:r>
+        <w:rPr>
+          <w:rFonts w:asciiTheme="majorHAnsi" w:hAnsiTheme="majorHAnsi" w:cstheme="majorHAnsi"/>
+        </w:rPr>
+        <w:t xml:space="preserve">Figure 1: Miniscope Layout. Shown is the location of the three filters, the four lenses (including two achromat lenses), and the sensor.</w:t>
+      </w:r>
+    </w:p>
+    <w:p>
+      <w:pPr>
+        <w:jc w:val="left"/>
+        <w:rPr>
+          <w:rFonts w:asciiTheme="majorHAnsi" w:hAnsiTheme="majorHAnsi" w:cstheme="majorHAnsi"/>
+        </w:rPr>
+      </w:pPr>
+    </w:p>
+    <w:p>
+      <w:pPr>
+        <w:jc w:val="left"/>
+        <w:rPr>
+          <w:rFonts w:asciiTheme="majorHAnsi" w:hAnsiTheme="majorHAnsi" w:cstheme="majorHAnsi"/>
+        </w:rPr>
+      </w:pPr>
+      <w:r>
+        <w:rPr>
+          <w:rFonts w:asciiTheme="majorHAnsi" w:hAnsiTheme="majorHAnsi" w:cstheme="majorHAnsi"/>
+        </w:rPr>
+        <w:t xml:space="preserve">Figure 2: Entire Miniscope + Organoid Layout. Schematic of the experimental setup used to measure calcium transients in cardiac organoids. Organoids are placed on a multi-well chip and electrically paced while calcium activity is recorded through fluorescence imaging using the UCLA Miniscope v4.</w:t>
+      </w:r>
+    </w:p>
+    <w:p>
+      <w:pPr>
+        <w:jc w:val="left"/>
+        <w:rPr>
+          <w:rFonts w:asciiTheme="majorHAnsi" w:hAnsiTheme="majorHAnsi" w:cstheme="majorHAnsi"/>
+        </w:rPr>
+      </w:pPr>
+    </w:p>
+    <w:p>
+      <w:pPr>
+        <w:jc w:val="left"/>
+        <w:rPr>
+          <w:rFonts w:asciiTheme="majorHAnsi" w:hAnsiTheme="majorHAnsi" w:cstheme="majorHAnsi"/>
+        </w:rPr>
+      </w:pPr>
+      <w:r>
+        <w:rPr>
+          <w:rFonts w:asciiTheme="majorHAnsi" w:hAnsiTheme="majorHAnsi" w:cstheme="majorHAnsi"/>
+        </w:rPr>
+        <w:t xml:space="preserve">Figure 3: Process of building the miniscope and collecting data from it.</w:t>
+      </w:r>
+    </w:p>
+    <w:p>
+      <w:pPr>
+        <w:jc w:val="left"/>
+        <w:rPr>
+          <w:rFonts w:asciiTheme="majorHAnsi" w:hAnsiTheme="majorHAnsi" w:cstheme="majorHAnsi"/>
+        </w:rPr>
+      </w:pPr>
+    </w:p>
+    <w:p>
+      <w:pPr>
+        <w:jc w:val="left"/>
+        <w:rPr>
+          <w:rFonts w:asciiTheme="majorHAnsi" w:hAnsiTheme="majorHAnsi" w:cstheme="majorHAnsi"/>
+        </w:rPr>
+      </w:pPr>
+      <w:r>
+        <w:rPr>
+          <w:rFonts w:asciiTheme="majorHAnsi" w:hAnsiTheme="majorHAnsi" w:cstheme="majorHAnsi"/>
+        </w:rPr>
+        <w:t xml:space="preserve">Figure 4: Steps for building the chip. First, a mold was printed with resin using a 3D printer. Then, PDMS was poured and cured in a two-step process. Then, the PDMS was plasma-treated to adhere to the glass slide. Finally, the electrodes were inserted. The cardiac organoids are then pipetted into the small ~3mm diameter wells.</w:t>
+      </w:r>
+    </w:p>
+    <w:p>
+      <w:pPr>
+        <w:jc w:val="left"/>
+        <w:rPr>
+          <w:rFonts w:asciiTheme="majorHAnsi" w:hAnsiTheme="majorHAnsi" w:cstheme="majorHAnsi"/>
+        </w:rPr>
+      </w:pPr>
+    </w:p>
+    <w:p>
+      <w:pPr>
+        <w:jc w:val="left"/>
+        <w:rPr>
+          <w:rFonts w:asciiTheme="majorHAnsi" w:hAnsiTheme="majorHAnsi" w:cstheme="majorHAnsi"/>
+        </w:rPr>
+      </w:pPr>
+      <w:r>
+        <w:rPr>
+          <w:rFonts w:asciiTheme="majorHAnsi" w:hAnsiTheme="majorHAnsi" w:cstheme="majorHAnsi"/>
+        </w:rPr>
+        <w:t xml:space="preserve">Figure 5: Circuit wiring of the pacing module. Note the low-cost setup including the LCD display, connection to the chip, and L298 drivers.</w:t>
+      </w:r>
+    </w:p>
+    <w:p>
+      <w:pPr/>
+      <w:r>
+        <w:t>Figure 6: Wiring of the Arduino-powered pacer.</w:t>
+      </w:r>
+    </w:p>
+    <w:p>
+      <w:pPr>
+        <w:jc w:val="left"/>
+        <w:rPr>
+          <w:rFonts w:asciiTheme="majorHAnsi" w:hAnsiTheme="majorHAnsi" w:cstheme="majorHAnsi"/>
+        </w:rPr>
+      </w:pPr>
+    </w:p>
+    <w:p>
+      <w:pPr>
+        <w:jc w:val="left"/>
+        <w:rPr>
+          <w:rFonts w:asciiTheme="majorHAnsi" w:hAnsiTheme="majorHAnsi" w:cstheme="majorHAnsi"/>
+        </w:rPr>
+      </w:pPr>
+      <w:r>
+        <w:rPr>
+          <w:rFonts w:asciiTheme="majorHAnsi" w:hAnsiTheme="majorHAnsi" w:cstheme="majorHAnsi"/>
+        </w:rPr>
+        <w:t xml:space="preserve">Table 1: Details of drugs used on the organoids with their expected effects and outcomes.</w:t>
+      </w:r>
+    </w:p>
+    <w:p>
+      <w:pPr>
+        <w:jc w:val="left"/>
+        <w:rPr>
+          <w:rFonts w:asciiTheme="majorHAnsi" w:hAnsiTheme="majorHAnsi" w:cstheme="majorHAnsi"/>
+        </w:rPr>
+      </w:pPr>
+    </w:p>
+    <w:p>
+      <w:pPr>
+        <w:jc w:val="left"/>
+        <w:rPr>
+          <w:rFonts w:asciiTheme="majorHAnsi" w:hAnsiTheme="majorHAnsi" w:cstheme="majorHAnsi"/>
+        </w:rPr>
+      </w:pPr>
+      <w:r>
+        <w:t>Figure 7: Drug Testing Process. Schematic of basic steps in conducting drug trials on cardiac organoids</w:t>
+      </w:r>
+    </w:p>
+    <w:p>
+      <w:pPr>
+        <w:jc w:val="left"/>
+        <w:rPr>
+          <w:rFonts w:asciiTheme="majorHAnsi" w:hAnsiTheme="majorHAnsi" w:cstheme="majorHAnsi"/>
+        </w:rPr>
+      </w:pPr>
+    </w:p>
+    <w:p>
+      <w:pPr>
+        <w:jc w:val="left"/>
+        <w:rPr>
+          <w:rFonts w:asciiTheme="majorHAnsi" w:hAnsiTheme="majorHAnsi" w:cstheme="majorHAnsi"/>
+        </w:rPr>
+      </w:pPr>
+      <w:r>
+        <w:t>Figure 8: A summary of the code analysis pipeline.</w:t>
+      </w:r>
+    </w:p>
+    <w:p>
+      <w:pPr>
+        <w:jc w:val="left"/>
+        <w:rPr>
+          <w:rFonts w:asciiTheme="majorHAnsi" w:hAnsiTheme="majorHAnsi" w:cstheme="majorHAnsi"/>
+        </w:rPr>
+      </w:pPr>
+    </w:p>
+    <w:p>
+      <w:pPr>
+        <w:jc w:val="left"/>
+        <w:rPr>
+          <w:rFonts w:asciiTheme="majorHAnsi" w:hAnsiTheme="majorHAnsi" w:cstheme="majorHAnsi"/>
+        </w:rPr>
+      </w:pPr>
+      <w:r>
+        <w:t>Figure 9: a.Fluorescence image of organoid capture by miniscope.  b Bright field image captured by miniscope. c. Image of organoid taken with ZEISS Axio microscope.</w:t>
+      </w:r>
+    </w:p>
+    <w:p>
+      <w:pPr>
+        <w:jc w:val="left"/>
+        <w:rPr>
+          <w:rFonts w:asciiTheme="majorHAnsi" w:hAnsiTheme="majorHAnsi" w:cstheme="majorHAnsi"/>
+        </w:rPr>
+      </w:pPr>
+    </w:p>
+    <w:p>
+      <w:pPr>
+        <w:jc w:val="left"/>
+        <w:rPr>
+          <w:rFonts w:asciiTheme="majorHAnsi" w:hAnsiTheme="majorHAnsi" w:cstheme="majorHAnsi"/>
+        </w:rPr>
+      </w:pPr>
+      <w:r>
+        <w:t>Figure 10: Mechanical contractions of the Control group (not treated with any drugs), along with different selected concentrations of the different drugs. These were paced at 0.5Hz.</w:t>
+      </w:r>
+    </w:p>
+    <w:p>
+      <w:pPr>
+        <w:jc w:val="left"/>
+        <w:rPr>
+          <w:rFonts w:asciiTheme="majorHAnsi" w:hAnsiTheme="majorHAnsi" w:cstheme="majorHAnsi"/>
+        </w:rPr>
+      </w:pPr>
+    </w:p>
+    <w:p>
+      <w:pPr>
+        <w:jc w:val="left"/>
+        <w:rPr>
+          <w:rFonts w:asciiTheme="majorHAnsi" w:hAnsiTheme="majorHAnsi" w:cstheme="majorHAnsi"/>
+        </w:rPr>
+      </w:pPr>
+      <w:r>
+        <w:t>Figure 11: Calcium fluorescence patterns of the Control group (not treated with any drugs), along with different selected concentrations of the different drugs. These were paced at 0.5Hz.</w:t>
+      </w:r>
+    </w:p>
+    <w:p>
+      <w:pPr>
+        <w:jc w:val="left"/>
+        <w:rPr>
+          <w:rFonts w:asciiTheme="majorHAnsi" w:hAnsiTheme="majorHAnsi" w:cstheme="majorHAnsi"/>
+        </w:rPr>
+      </w:pPr>
+    </w:p>
+    <w:p>
+      <w:pPr>
+        <w:jc w:val="left"/>
+        <w:rPr>
+          <w:rFonts w:asciiTheme="majorHAnsi" w:hAnsiTheme="majorHAnsi" w:cstheme="majorHAnsi"/>
+        </w:rPr>
+      </w:pPr>
+      <w:r>
+        <w:t>Figure 12: Comparison of different key metrics for the different drug conditions. One-Way ANOVA with post-hoc pairwise comparisons (each drug vs Control) was calculated and labelled * on the bar chart if p &lt; 0.05, for Decay50, Contraction, and Relaxation Time. To determine whether variability itself differs, we used Levene's test (variance-comparison test). These were paced at 0.5Hz.</w:t>
+      </w:r>
+    </w:p>
+    <w:p>
+      <w:pPr>
+        <w:jc w:val="left"/>
+        <w:rPr>
+          <w:rFonts w:asciiTheme="majorHAnsi" w:hAnsiTheme="majorHAnsi" w:cstheme="majorHAnsi"/>
+        </w:rPr>
+      </w:pPr>
+    </w:p>
+    <w:p>
+      <w:pPr>
+        <w:jc w:val="left"/>
+        <w:rPr>
+          <w:rFonts w:asciiTheme="majorHAnsi" w:hAnsiTheme="majorHAnsi" w:cstheme="majorHAnsi"/>
+        </w:rPr>
+      </w:pPr>
+      <w:r>
+        <w:t>Figure 13: Heatmap of the number of different organoids (the given number) and in colour, the number of data points extracted from those different organoids in order to do analysis.</w:t>
+      </w:r>
+    </w:p>
+    <w:p>
+      <w:pPr>
+        <w:rPr>
+          <w:rFonts w:asciiTheme="majorHAnsi" w:hAnsiTheme="majorHAnsi" w:cstheme="majorHAnsi"/>
+          <w:color w:val="808080"/>
+        </w:rPr>
+      </w:pPr>
+    </w:p>
+    <w:p>
+      <w:pPr>
         <w:rPr>
           <w:rFonts w:asciiTheme="majorHAnsi" w:hAnsiTheme="majorHAnsi" w:cstheme="majorHAnsi"/>
           <w:b/>
         </w:rPr>
-        <w:t xml:space="preserve">Figure 9</w:t>
-      </w:r>
-      <w:r>
-        <w:rPr>
-          <w:rFonts w:asciiTheme="majorHAnsi" w:hAnsiTheme="majorHAnsi" w:cstheme="majorHAnsi"/>
-        </w:rPr>
-        <w:t xml:space="preserve"> here]</w:t>
-      </w:r>
-    </w:p>
-    <w:p>
-      <w:pPr>
-        <w:jc w:val="left"/>
-        <w:rPr>
-          <w:rFonts w:asciiTheme="majorHAnsi" w:hAnsiTheme="majorHAnsi" w:cstheme="majorHAnsi"/>
-        </w:rPr>
-      </w:pPr>
-    </w:p>
-    <w:p>
-      <w:pPr>
-        <w:jc w:val="left"/>
-        <w:rPr>
-          <w:rFonts w:asciiTheme="majorHAnsi" w:hAnsiTheme="majorHAnsi" w:cstheme="majorHAnsi"/>
-        </w:rPr>
-      </w:pPr>
-      <w:r>
-        <w:rPr>
-          <w:rFonts w:asciiTheme="majorHAnsi" w:hAnsiTheme="majorHAnsi" w:cstheme="majorHAnsi"/>
-        </w:rPr>
-        <w:t xml:space="preserve">[Place </w:t>
-      </w:r>
+      </w:pPr>
       <w:r>
         <w:rPr>
           <w:rFonts w:asciiTheme="majorHAnsi" w:hAnsiTheme="majorHAnsi" w:cstheme="majorHAnsi"/>
           <w:b/>
         </w:rPr>
-        <w:t xml:space="preserve">Figure 10</w:t>
-      </w:r>
-      <w:r>
-        <w:rPr>
-          <w:rFonts w:asciiTheme="majorHAnsi" w:hAnsiTheme="majorHAnsi" w:cstheme="majorHAnsi"/>
-        </w:rPr>
-        <w:t xml:space="preserve"> here]</w:t>
-      </w:r>
-    </w:p>
-    <w:p>
-      <w:pPr>
-        <w:jc w:val="left"/>
-        <w:rPr>
-          <w:rFonts w:asciiTheme="majorHAnsi" w:hAnsiTheme="majorHAnsi" w:cstheme="majorHAnsi"/>
-        </w:rPr>
-      </w:pPr>
-    </w:p>
-    <w:p>
-      <w:pPr>
-        <w:jc w:val="left"/>
-        <w:rPr>
-          <w:rFonts w:asciiTheme="majorHAnsi" w:hAnsiTheme="majorHAnsi" w:cstheme="majorHAnsi"/>
-        </w:rPr>
-      </w:pPr>
-      <w:r>
-        <w:t>Sample images of the organoids under different microscope conditions can be seen in Figure 8 for reference. Figures 9 and 10 show clear visual differences in calcium signaling and contraction between the control and drug treated organoids. In Figure 10, the control group shows regular and consistent calcium peaks, while the thapsigargin samples appear more irregular, which matches the higher beat-to-beat variability we measured. The dofetilide and quinidine traces also look broader and return to baseline more slowly, suggesting slower calcium decay.</w:t>
-      </w:r>
-    </w:p>
-    <w:p>
-      <w:pPr>
-        <w:jc w:val="left"/>
-        <w:rPr>
-          <w:rFonts w:asciiTheme="majorHAnsi" w:hAnsiTheme="majorHAnsi" w:cstheme="majorHAnsi"/>
-        </w:rPr>
-      </w:pPr>
-    </w:p>
-    <w:p>
-      <w:pPr>
-        <w:jc w:val="left"/>
-        <w:rPr>
-          <w:rFonts w:asciiTheme="majorHAnsi" w:hAnsiTheme="majorHAnsi" w:cstheme="majorHAnsi"/>
-        </w:rPr>
-      </w:pPr>
-      <w:r>
-        <w:t>Similar patterns can also be seen in the mechanical contraction traces in Figure 9. The control group shows steady contractions, while the thapsigargin samples appear less regular and the dofetilide and quinidine traces look wider, suggesting longer contraction and relaxation phases.</w:t>
-      </w:r>
-    </w:p>
-    <w:p>
-      <w:pPr>
-        <w:jc w:val="left"/>
-        <w:rPr>
-          <w:rFonts w:asciiTheme="majorHAnsi" w:hAnsiTheme="majorHAnsi" w:cstheme="majorHAnsi"/>
-        </w:rPr>
-      </w:pPr>
-    </w:p>
-    <w:p>
-      <w:pPr>
-        <w:jc w:val="left"/>
-        <w:rPr>
-          <w:rFonts w:asciiTheme="majorHAnsi" w:hAnsiTheme="majorHAnsi" w:cstheme="majorHAnsi"/>
-        </w:rPr>
-      </w:pPr>
-      <w:r>
-        <w:rPr>
-          <w:rFonts w:asciiTheme="majorHAnsi" w:hAnsiTheme="majorHAnsi" w:cstheme="majorHAnsi"/>
-        </w:rPr>
-        <w:t xml:space="preserve">[Place </w:t>
-      </w:r>
-      <w:r>
-        <w:rPr>
-          <w:rFonts w:asciiTheme="majorHAnsi" w:hAnsiTheme="majorHAnsi" w:cstheme="majorHAnsi"/>
-          <w:b/>
-        </w:rPr>
-        <w:t xml:space="preserve">Figure 11</w:t>
-      </w:r>
-      <w:r>
-        <w:rPr>
-          <w:rFonts w:asciiTheme="majorHAnsi" w:hAnsiTheme="majorHAnsi" w:cstheme="majorHAnsi"/>
-        </w:rPr>
-        <w:t xml:space="preserve"> here]</w:t>
-      </w:r>
-    </w:p>
-    <w:p>
-      <w:pPr>
-        <w:jc w:val="left"/>
-        <w:rPr>
-          <w:rFonts w:asciiTheme="majorHAnsi" w:hAnsiTheme="majorHAnsi" w:cstheme="majorHAnsi"/>
-        </w:rPr>
-      </w:pPr>
-    </w:p>
-    <w:p>
-      <w:pPr>
-        <w:jc w:val="left"/>
-        <w:rPr>
-          <w:rFonts w:asciiTheme="majorHAnsi" w:hAnsiTheme="majorHAnsi" w:cstheme="majorHAnsi"/>
-        </w:rPr>
-      </w:pPr>
-      <w:r>
-        <w:rPr>
-          <w:rFonts w:asciiTheme="majorHAnsi" w:hAnsiTheme="majorHAnsi" w:cstheme="majorHAnsi"/>
-        </w:rPr>
-        <w:t xml:space="preserve">[Place </w:t>
-      </w:r>
-      <w:r>
-        <w:rPr>
-          <w:rFonts w:asciiTheme="majorHAnsi" w:hAnsiTheme="majorHAnsi" w:cstheme="majorHAnsi"/>
-          <w:b/>
-        </w:rPr>
-        <w:t xml:space="preserve">Figure 12</w:t>
-      </w:r>
-      <w:r>
-        <w:rPr>
-          <w:rFonts w:asciiTheme="majorHAnsi" w:hAnsiTheme="majorHAnsi" w:cstheme="majorHAnsi"/>
-        </w:rPr>
-        <w:t xml:space="preserve"> here]</w:t>
-      </w:r>
-    </w:p>
-    <w:p>
-      <w:pPr>
-        <w:jc w:val="left"/>
-        <w:rPr>
-          <w:rFonts w:asciiTheme="majorHAnsi" w:hAnsiTheme="majorHAnsi" w:cstheme="majorHAnsi"/>
-        </w:rPr>
-      </w:pPr>
-    </w:p>
-    <w:p>
-      <w:pPr>
-        <w:jc w:val="left"/>
-        <w:rPr>
-          <w:rFonts w:asciiTheme="majorHAnsi" w:hAnsiTheme="majorHAnsi" w:cstheme="majorHAnsi"/>
-        </w:rPr>
-      </w:pPr>
-      <w:r>
-        <w:rPr>
-          <w:rFonts w:asciiTheme="majorHAnsi" w:hAnsiTheme="majorHAnsi" w:cstheme="majorHAnsi"/>
-        </w:rPr>
-        <w:t xml:space="preserve">These experimental results largely align with our predicted effects for each drug on calcium transient dynamics and contraction in the cardiac organoids. Figure 11 shows that Dolfetide, which is an IKr potassium channel blocker expected to prolong repolarization, predicted an increase in calcium transience duration and slower intracellular calcium clearance. The data shows an increase in both Decay50  and relaxation time compared with the control indicating more prolonged calcium signaling and a delay in recovery after contraction. Contraction time was also slightly elevated, consistent with the idea that prolonging the cardiac action potential extends the calcium transient.</w:t>
-      </w:r>
-    </w:p>
-    <w:p>
-      <w:pPr>
-        <w:jc w:val="left"/>
-        <w:rPr>
-          <w:rFonts w:asciiTheme="majorHAnsi" w:hAnsiTheme="majorHAnsi" w:cstheme="majorHAnsi"/>
-        </w:rPr>
-      </w:pPr>
-    </w:p>
-    <w:p>
-      <w:pPr>
-        <w:jc w:val="left"/>
-        <w:rPr>
-          <w:rFonts w:asciiTheme="majorHAnsi" w:hAnsiTheme="majorHAnsi" w:cstheme="majorHAnsi"/>
-        </w:rPr>
-      </w:pPr>
-      <w:r>
-        <w:rPr>
-          <w:rFonts w:asciiTheme="majorHAnsi" w:hAnsiTheme="majorHAnsi" w:cstheme="majorHAnsi"/>
-        </w:rPr>
-        <w:t xml:space="preserve">For thapsigargin, the results followed consistent trends although some variation was observed from expected outcomes. Organoids treated with Thapsigargin which inhibits SERCA are expected to disrupt calcium reuptake and beating patterns. The changes in the calcium transient parameters such as relaxation and decay were smaller than anticipated. However, The organoids treated with thapsigargin showed the largest increase in beat-to-beat variability, which supports the idea that inhibiting SERCA reduces rhythm stability.</w:t>
-      </w:r>
-    </w:p>
-    <w:p>
-      <w:pPr>
-        <w:jc w:val="left"/>
-        <w:rPr>
-          <w:rFonts w:asciiTheme="majorHAnsi" w:hAnsiTheme="majorHAnsi" w:cstheme="majorHAnsi"/>
-        </w:rPr>
-      </w:pPr>
-    </w:p>
-    <w:p>
-      <w:pPr>
-        <w:jc w:val="left"/>
-        <w:rPr>
-          <w:rFonts w:asciiTheme="majorHAnsi" w:hAnsiTheme="majorHAnsi" w:cstheme="majorHAnsi"/>
-        </w:rPr>
-      </w:pPr>
-      <w:r>
-        <w:rPr>
-          <w:rFonts w:asciiTheme="majorHAnsi" w:hAnsiTheme="majorHAnsi" w:cstheme="majorHAnsi"/>
-        </w:rPr>
-        <w:t xml:space="preserve">For quinidine, the observed results showed an increase in Decay50 and relaxation time compared to the control, indicating slower calcium clearance after each beat. However, contraction time was slightly lower than the control condition, suggesting that quinidine affected calcium decay and relaxation more than the contraction phase in this dataset.</w:t>
-      </w:r>
-    </w:p>
-    <w:p>
-      <w:pPr>
-        <w:jc w:val="left"/>
-        <w:rPr>
-          <w:rFonts w:asciiTheme="majorHAnsi" w:hAnsiTheme="majorHAnsi" w:cstheme="majorHAnsi"/>
-        </w:rPr>
-      </w:pPr>
-    </w:p>
-    <w:p>
-      <w:pPr>
-        <w:jc w:val="left"/>
-        <w:rPr>
-          <w:rFonts w:asciiTheme="majorHAnsi" w:hAnsiTheme="majorHAnsi" w:cstheme="majorHAnsi"/>
-        </w:rPr>
-      </w:pPr>
-      <w:r>
-        <w:rPr>
-          <w:rFonts w:asciiTheme="majorHAnsi" w:hAnsiTheme="majorHAnsi" w:cstheme="majorHAnsi"/>
-        </w:rPr>
-        <w:t xml:space="preserve">Due to the relatively low sample size illustrated by Figure 12, and testing limitations, the results do not fully reflect all of the expected outcomes predicted from the pharmacological mechanisms of the drugs. However, the observed trends are consistent within each drug class and generally align with the anticipated direction of change in calcium transient and contraction dynamics. Despite the variability in some measurements the system was still able to detect clear differences between control organoids and those exposed to the different drugs. This consistency suggests that the platform is sensitive enough to capture meaningful changes in organoid behavior. Importantly, the device was able to identify measurable changes in both contractile behavior and calcium transient dynamics. This indicates that it can simultaneously monitor functional and electrophysiological responses of cardiac organoids.</w:t>
-      </w:r>
-    </w:p>
-    <w:p>
-      <w:pPr>
-        <w:rPr>
-          <w:rFonts w:asciiTheme="majorHAnsi" w:hAnsiTheme="majorHAnsi" w:cstheme="majorHAnsi"/>
-          <w:color w:val="808080"/>
-        </w:rPr>
-      </w:pPr>
-    </w:p>
-    <w:p>
-      <w:pPr>
-        <w:rPr>
-          <w:rFonts w:asciiTheme="majorHAnsi" w:hAnsiTheme="majorHAnsi" w:cstheme="majorHAnsi"/>
-          <w:color w:val="808080"/>
-        </w:rPr>
-      </w:pPr>
-      <w:r>
-        <w:rPr>
-          <w:rFonts w:asciiTheme="majorHAnsi" w:hAnsiTheme="majorHAnsi" w:cstheme="majorHAnsi"/>
-          <w:b/>
-        </w:rPr>
-        <w:t>FIGURE AND TABLE LEGENDS:</w:t>
-      </w:r>
-    </w:p>
-    <w:p>
-      <w:pPr>
-        <w:jc w:val="left"/>
-        <w:rPr>
-          <w:rFonts w:asciiTheme="majorHAnsi" w:hAnsiTheme="majorHAnsi" w:cstheme="majorHAnsi"/>
-        </w:rPr>
-      </w:pPr>
-      <w:r>
-        <w:rPr>
-          <w:rFonts w:asciiTheme="majorHAnsi" w:hAnsiTheme="majorHAnsi" w:cstheme="majorHAnsi"/>
-        </w:rPr>
-        <w:t xml:space="preserve">Figure 1: Miniscope Layout. Shown is the location of the three filters, the four lenses (including two achromat lenses), and the sensor.</w:t>
-      </w:r>
-    </w:p>
-    <w:p>
-      <w:pPr>
-        <w:jc w:val="left"/>
-        <w:rPr>
-          <w:rFonts w:asciiTheme="majorHAnsi" w:hAnsiTheme="majorHAnsi" w:cstheme="majorHAnsi"/>
-        </w:rPr>
-      </w:pPr>
-    </w:p>
-    <w:p>
-      <w:pPr>
-        <w:jc w:val="left"/>
-        <w:rPr>
-          <w:rFonts w:asciiTheme="majorHAnsi" w:hAnsiTheme="majorHAnsi" w:cstheme="majorHAnsi"/>
-        </w:rPr>
-      </w:pPr>
-      <w:r>
-        <w:rPr>
-          <w:rFonts w:asciiTheme="majorHAnsi" w:hAnsiTheme="majorHAnsi" w:cstheme="majorHAnsi"/>
-        </w:rPr>
-        <w:t xml:space="preserve">Figure 2: Entire Miniscope + Organoid Layout. Schematic of the experimental setup used to measure calcium transients in cardiac organoids. Organoids are placed on a multi-well chip and electrically paced while calcium activity is recorded through fluorescence imaging using the UCLA Miniscope v4.</w:t>
-      </w:r>
-    </w:p>
-    <w:p>
-      <w:pPr>
-        <w:jc w:val="left"/>
-        <w:rPr>
-          <w:rFonts w:asciiTheme="majorHAnsi" w:hAnsiTheme="majorHAnsi" w:cstheme="majorHAnsi"/>
-        </w:rPr>
-      </w:pPr>
-    </w:p>
-    <w:p>
-      <w:pPr>
-        <w:jc w:val="left"/>
-        <w:rPr>
-          <w:rFonts w:asciiTheme="majorHAnsi" w:hAnsiTheme="majorHAnsi" w:cstheme="majorHAnsi"/>
-        </w:rPr>
-      </w:pPr>
-      <w:r>
-        <w:rPr>
-          <w:rFonts w:asciiTheme="majorHAnsi" w:hAnsiTheme="majorHAnsi" w:cstheme="majorHAnsi"/>
-        </w:rPr>
-        <w:t xml:space="preserve">Figure 3: Process of building the miniscope and collecting data from it.</w:t>
-      </w:r>
-    </w:p>
-    <w:p>
-      <w:pPr>
-        <w:jc w:val="left"/>
-        <w:rPr>
-          <w:rFonts w:asciiTheme="majorHAnsi" w:hAnsiTheme="majorHAnsi" w:cstheme="majorHAnsi"/>
-        </w:rPr>
-      </w:pPr>
-    </w:p>
-    <w:p>
-      <w:pPr>
-        <w:jc w:val="left"/>
-        <w:rPr>
-          <w:rFonts w:asciiTheme="majorHAnsi" w:hAnsiTheme="majorHAnsi" w:cstheme="majorHAnsi"/>
-        </w:rPr>
-      </w:pPr>
-      <w:r>
-        <w:rPr>
-          <w:rFonts w:asciiTheme="majorHAnsi" w:hAnsiTheme="majorHAnsi" w:cstheme="majorHAnsi"/>
-        </w:rPr>
-        <w:t xml:space="preserve">Figure 4: Steps for building the chip. First, a mold was printed with resin using a 3D printer. Then, PDMS was poured and cured in a two-step process. Then, the PDMS was plasma-treated to adhere to the glass slide. Finally, the electrodes were inserted. The cardiac organoids are then pipetted into the small ~3mm diameter wells.</w:t>
-      </w:r>
-    </w:p>
-    <w:p>
-      <w:pPr>
-        <w:jc w:val="left"/>
-        <w:rPr>
-          <w:rFonts w:asciiTheme="majorHAnsi" w:hAnsiTheme="majorHAnsi" w:cstheme="majorHAnsi"/>
-        </w:rPr>
-      </w:pPr>
-    </w:p>
-    <w:p>
-      <w:pPr>
-        <w:jc w:val="left"/>
-        <w:rPr>
-          <w:rFonts w:asciiTheme="majorHAnsi" w:hAnsiTheme="majorHAnsi" w:cstheme="majorHAnsi"/>
-        </w:rPr>
-      </w:pPr>
-      <w:r>
-        <w:rPr>
-          <w:rFonts w:asciiTheme="majorHAnsi" w:hAnsiTheme="majorHAnsi" w:cstheme="majorHAnsi"/>
-        </w:rPr>
-        <w:t xml:space="preserve">Figure 5: Circuit wiring of the pacing module. Note the low-cost setup including the LCD display, connection to the chip, and L298 drivers.</w:t>
-      </w:r>
-    </w:p>
-    <w:p>
-      <w:pPr>
-        <w:jc w:val="left"/>
-        <w:rPr>
-          <w:rFonts w:asciiTheme="majorHAnsi" w:hAnsiTheme="majorHAnsi" w:cstheme="majorHAnsi"/>
-        </w:rPr>
-      </w:pPr>
-    </w:p>
-    <w:p>
-      <w:pPr>
-        <w:jc w:val="left"/>
-        <w:rPr>
-          <w:rFonts w:asciiTheme="majorHAnsi" w:hAnsiTheme="majorHAnsi" w:cstheme="majorHAnsi"/>
-        </w:rPr>
-      </w:pPr>
-      <w:r>
-        <w:rPr>
-          <w:rFonts w:asciiTheme="majorHAnsi" w:hAnsiTheme="majorHAnsi" w:cstheme="majorHAnsi"/>
-        </w:rPr>
-        <w:t xml:space="preserve">Table 1: Details of drugs used on the organoids with their expected effects and outcomes.</w:t>
-      </w:r>
-    </w:p>
-    <w:p>
-      <w:pPr>
-        <w:jc w:val="left"/>
-        <w:rPr>
-          <w:rFonts w:asciiTheme="majorHAnsi" w:hAnsiTheme="majorHAnsi" w:cstheme="majorHAnsi"/>
-        </w:rPr>
-      </w:pPr>
-    </w:p>
-    <w:p>
-      <w:pPr>
-        <w:jc w:val="left"/>
-        <w:rPr>
-          <w:rFonts w:asciiTheme="majorHAnsi" w:hAnsiTheme="majorHAnsi" w:cstheme="majorHAnsi"/>
-        </w:rPr>
-      </w:pPr>
-      <w:r>
-        <w:rPr>
-          <w:rFonts w:asciiTheme="majorHAnsi" w:hAnsiTheme="majorHAnsi" w:cstheme="majorHAnsi"/>
-        </w:rPr>
-        <w:t xml:space="preserve">Figure 6: Drug Testing Process. Schematic of basic steps in conducting drug trials on cardiac organoids</w:t>
-      </w:r>
-    </w:p>
-    <w:p>
-      <w:pPr>
-        <w:jc w:val="left"/>
-        <w:rPr>
-          <w:rFonts w:asciiTheme="majorHAnsi" w:hAnsiTheme="majorHAnsi" w:cstheme="majorHAnsi"/>
-        </w:rPr>
-      </w:pPr>
-    </w:p>
-    <w:p>
-      <w:pPr>
-        <w:jc w:val="left"/>
-        <w:rPr>
-          <w:rFonts w:asciiTheme="majorHAnsi" w:hAnsiTheme="majorHAnsi" w:cstheme="majorHAnsi"/>
-        </w:rPr>
-      </w:pPr>
-      <w:r>
-        <w:rPr>
-          <w:rFonts w:asciiTheme="majorHAnsi" w:hAnsiTheme="majorHAnsi" w:cstheme="majorHAnsi"/>
-        </w:rPr>
-        <w:t xml:space="preserve">Figure 7: A summary of the code analysis pipeline.</w:t>
-      </w:r>
-    </w:p>
-    <w:p>
-      <w:pPr>
-        <w:jc w:val="left"/>
-        <w:rPr>
-          <w:rFonts w:asciiTheme="majorHAnsi" w:hAnsiTheme="majorHAnsi" w:cstheme="majorHAnsi"/>
-        </w:rPr>
-      </w:pPr>
-    </w:p>
-    <w:p>
-      <w:pPr>
-        <w:jc w:val="left"/>
-        <w:rPr>
-          <w:rFonts w:asciiTheme="majorHAnsi" w:hAnsiTheme="majorHAnsi" w:cstheme="majorHAnsi"/>
-        </w:rPr>
-      </w:pPr>
-      <w:r>
-        <w:rPr>
-          <w:rFonts w:asciiTheme="majorHAnsi" w:hAnsiTheme="majorHAnsi" w:cstheme="majorHAnsi"/>
-        </w:rPr>
-        <w:t xml:space="preserve">Figure 8: a.Fluorescence image of organoid capture by miniscope.  b Bright field image captured by miniscope. c. Image of organoid taken with ZEISS Axio microscope.</w:t>
-      </w:r>
-    </w:p>
-    <w:p>
-      <w:pPr>
-        <w:jc w:val="left"/>
-        <w:rPr>
-          <w:rFonts w:asciiTheme="majorHAnsi" w:hAnsiTheme="majorHAnsi" w:cstheme="majorHAnsi"/>
-        </w:rPr>
-      </w:pPr>
-    </w:p>
-    <w:p>
-      <w:pPr>
-        <w:jc w:val="left"/>
-        <w:rPr>
-          <w:rFonts w:asciiTheme="majorHAnsi" w:hAnsiTheme="majorHAnsi" w:cstheme="majorHAnsi"/>
-        </w:rPr>
-      </w:pPr>
-      <w:r>
-        <w:rPr>
-          <w:rFonts w:asciiTheme="majorHAnsi" w:hAnsiTheme="majorHAnsi" w:cstheme="majorHAnsi"/>
-        </w:rPr>
-        <w:t xml:space="preserve">Figure 9: Mechanical contractions of the Control group (not treated with any drugs), along with different selected concentrations of the different drugs. These were paced at 0.5Hz.</w:t>
-      </w:r>
-    </w:p>
-    <w:p>
-      <w:pPr>
-        <w:jc w:val="left"/>
-        <w:rPr>
-          <w:rFonts w:asciiTheme="majorHAnsi" w:hAnsiTheme="majorHAnsi" w:cstheme="majorHAnsi"/>
-        </w:rPr>
-      </w:pPr>
-    </w:p>
-    <w:p>
-      <w:pPr>
-        <w:jc w:val="left"/>
-        <w:rPr>
-          <w:rFonts w:asciiTheme="majorHAnsi" w:hAnsiTheme="majorHAnsi" w:cstheme="majorHAnsi"/>
-        </w:rPr>
-      </w:pPr>
-      <w:r>
-        <w:rPr>
-          <w:rFonts w:asciiTheme="majorHAnsi" w:hAnsiTheme="majorHAnsi" w:cstheme="majorHAnsi"/>
-        </w:rPr>
-        <w:t xml:space="preserve">Figure 10: Calcium fluorescence patterns of the Control group (not treated with any drugs), along with different selected concentrations of the different drugs. These were paced at 0.5Hz.</w:t>
-      </w:r>
-    </w:p>
-    <w:p>
-      <w:pPr>
-        <w:jc w:val="left"/>
-        <w:rPr>
-          <w:rFonts w:asciiTheme="majorHAnsi" w:hAnsiTheme="majorHAnsi" w:cstheme="majorHAnsi"/>
-        </w:rPr>
-      </w:pPr>
-    </w:p>
-    <w:p>
-      <w:pPr>
-        <w:jc w:val="left"/>
-        <w:rPr>
-          <w:rFonts w:asciiTheme="majorHAnsi" w:hAnsiTheme="majorHAnsi" w:cstheme="majorHAnsi"/>
-        </w:rPr>
-      </w:pPr>
-      <w:r>
-        <w:rPr>
-          <w:rFonts w:asciiTheme="majorHAnsi" w:hAnsiTheme="majorHAnsi" w:cstheme="majorHAnsi"/>
-        </w:rPr>
-        <w:t xml:space="preserve">Figure 11: Comparison of different key metrics for the different drug conditions. One-Way ANOVA with post-hoc pairwise comparisons (each drug vs Control) was calculated and labelled * on the bar chart if p &lt; 0.05, for Decay50, Contraction, and Relaxation Time. To determine whether variability itself differs, we used Levene's test (variance-comparison test). These were paced at 0.5Hz.</w:t>
-      </w:r>
-    </w:p>
-    <w:p>
-      <w:pPr>
-        <w:jc w:val="left"/>
-        <w:rPr>
-          <w:rFonts w:asciiTheme="majorHAnsi" w:hAnsiTheme="majorHAnsi" w:cstheme="majorHAnsi"/>
-        </w:rPr>
-      </w:pPr>
-    </w:p>
-    <w:p>
-      <w:pPr>
-        <w:jc w:val="left"/>
-        <w:rPr>
-          <w:rFonts w:asciiTheme="majorHAnsi" w:hAnsiTheme="majorHAnsi" w:cstheme="majorHAnsi"/>
-        </w:rPr>
-      </w:pPr>
-      <w:r>
-        <w:rPr>
-          <w:rFonts w:asciiTheme="majorHAnsi" w:hAnsiTheme="majorHAnsi" w:cstheme="majorHAnsi"/>
-        </w:rPr>
-        <w:t xml:space="preserve">Figure 12: Heatmap of the number of different organoids (the given number) and in colour, the number of data points extracted from those different organoids in order to do analysis.</w:t>
-      </w:r>
-    </w:p>
-    <w:p>
-      <w:pPr>
-        <w:rPr>
-          <w:rFonts w:asciiTheme="majorHAnsi" w:hAnsiTheme="majorHAnsi" w:cstheme="majorHAnsi"/>
-          <w:color w:val="808080"/>
-        </w:rPr>
-      </w:pPr>
-    </w:p>
-    <w:p>
-      <w:pPr>
-        <w:rPr>
-          <w:rFonts w:asciiTheme="majorHAnsi" w:hAnsiTheme="majorHAnsi" w:cstheme="majorHAnsi"/>
-          <w:b/>
-        </w:rPr>
-      </w:pPr>
-      <w:r>
-        <w:rPr>
-          <w:rFonts w:asciiTheme="majorHAnsi" w:hAnsiTheme="majorHAnsi" w:cstheme="majorHAnsi"/>
-          <w:b/>
-        </w:rPr>
         <w:t xml:space="preserve">DISCUSSION: </w:t>
       </w:r>
     </w:p>
@@ -2682,10 +2552,7 @@
         </w:rPr>
       </w:pPr>
       <w:r>
-        <w:rPr>
-          <w:rFonts w:asciiTheme="majorHAnsi" w:hAnsiTheme="majorHAnsi" w:cstheme="majorHAnsi"/>
-        </w:rPr>
-        <w:t xml:space="preserve">When it comes to result significance, as shown in Figure 8, we were able to verify the accuracy of the miniscope and analysis pipeline by collecting calcium transience data that matched the commercial pacing of the organoid in frequency. Note that the calcium transience readings from the groups treated with drugs contained greater variation in calcium peak amplitude and regularity. As expected from previous research, the organoid-Thapsigargin group had displayed elevated calcium transience and broader peak morphology, consistent with disruption of intracellular calcium handling caused by inhibition of the sarco/endoplasmic reticulum Ca²⁺ ATPase (SERCA), which reduces calcium reuptake into the endoplasmic reticulum and prolongs cytosolic calcium elevation.</w:t>
+        <w:t>When it comes to result significance, as shown in Figure 9, we were able to verify the accuracy of the miniscope and analysis pipeline by collecting calcium transience data that matched the commercial pacing of the organoid in frequency. Note that the calcium transience readings from the groups treated with drugs contained greater variation in calcium peak amplitude and regularity. As expected from previous research, the organoid-Thapsigargin group had displayed elevated calcium transience and broader peak morphology, consistent with disruption of intracellular calcium handling caused by inhibition of the sarco/endoplasmic reticulum Ca²⁺ ATPase (SERCA), which reduces calcium reuptake into the endoplasmic reticulum and prolongs cytosolic calcium elevation.</w:t>
       </w:r>
     </w:p>
     <w:p>

</xml_diff>